<commit_message>
Plan E: E16 and E17 done (0.5.0 walkthrough, user guide, rules notes, questions)
Walkthrough 0.5.0 section (38 steps) with Dev examples to re-check on Prod;
user guide brought to 0.5.0 (transfers, phase-in, criteria, several
branches and dealer groups); REORDER-RULES round 2 steps, transfer
suggestions and transfer rules; questions doc with Ben's 10-27 answers.

Co-Authored-By: Claude Opus 5.5 <noreply@anthropic.com>
</commit_message>
<xml_diff>
--- a/projects/part order tool - app/for-users/Non-JD Order Tool - Questions.docx
+++ b/projects/part order tool - app/for-users/Non-JD Order Tool - Questions.docx
@@ -21,16 +21,26 @@
         <w:rPr>
           <w:color w:val="595959"/>
         </w:rPr>
-        <w:t xml:space="preserve">For Ben, with a section for Shannon · Updated October 26, 2026 after Ben’s answers (version 0.2.0) · App: https://10.110.100.13:8443</w:t>
-      </w:r>
-    </w:p>
-    <w:p>
-      <w:pPr>
-        <w:keepNext w:val="false"/>
-        <w:spacing w:after="120"/>
-      </w:pPr>
-      <w:r>
-        <w:t xml:space="preserve">Ben answered Parts 1 and 2 on October 23. Each answered item now gives his answer in one line and what we did. </w:t>
+        <w:t xml:space="preserve">For Ben, with a section for Shannon · Updated October 28, 2026 (version 0.5.0) · App: https://10.110.100.13:8443</w:t>
+      </w:r>
+    </w:p>
+    <w:p>
+      <w:pPr>
+        <w:keepNext w:val="false"/>
+        <w:spacing w:after="120"/>
+      </w:pPr>
+      <w:r>
+        <w:t xml:space="preserve">Ben answered Parts 1 and 2 on October 23 and the transfer questions (</w:t>
+      </w:r>
+      <w:r>
+        <w:rPr>
+          <w:b/>
+          <w:bCs/>
+        </w:rPr>
+        <w:t xml:space="preserve">Part 5</w:t>
+      </w:r>
+      <w:r>
+        <w:t xml:space="preserve">) on October 27. Each answered item gives his answer in one line and what we did. Still open: </w:t>
       </w:r>
       <w:r>
         <w:rPr>
@@ -40,17 +50,27 @@
         <w:t xml:space="preserve">Part 3</w:t>
       </w:r>
       <w:r>
-        <w:t xml:space="preserve"> (for Shannon) is still open, and </w:t>
-      </w:r>
-      <w:r>
-        <w:rPr>
-          <w:b/>
-          <w:bCs/>
-        </w:rPr>
-        <w:t xml:space="preserve">Part 4</w:t>
-      </w:r>
-      <w:r>
-        <w:t xml:space="preserve"> has the new questions that came out of round 1. Write your answers in the spaces, or reply by email with the item numbers.</w:t>
+        <w:t xml:space="preserve"> (for Shannon), </w:t>
+      </w:r>
+      <w:r>
+        <w:rPr>
+          <w:b/>
+          <w:bCs/>
+        </w:rPr>
+        <w:t xml:space="preserve">N1 to N3</w:t>
+      </w:r>
+      <w:r>
+        <w:t xml:space="preserve"> and </w:t>
+      </w:r>
+      <w:r>
+        <w:rPr>
+          <w:b/>
+          <w:bCs/>
+        </w:rPr>
+        <w:t xml:space="preserve">N5</w:t>
+      </w:r>
+      <w:r>
+        <w:t xml:space="preserve">. Write your answers in the spaces, or reply by email with the item numbers.</w:t>
       </w:r>
     </w:p>
     <w:p>
@@ -66,10 +86,10 @@
           <w:b/>
           <w:bCs/>
         </w:rPr>
-        <w:t xml:space="preserve">Round 1 changes</w:t>
-      </w:r>
-      <w:r>
-        <w:t xml:space="preserve"> document sums up what changed, and the </w:t>
+        <w:t xml:space="preserve">walkthrough</w:t>
+      </w:r>
+      <w:r>
+        <w:t xml:space="preserve">’s “What’s new” part sums up what changed in each version, and the </w:t>
       </w:r>
       <w:r>
         <w:rPr>
@@ -233,7 +253,7 @@
         <w:t xml:space="preserve">Special statuses</w:t>
       </w:r>
       <w:r>
-        <w:t xml:space="preserve"> page; Phase-in joins it in round 2.</w:t>
+        <w:t xml:space="preserve"> page; phase-in joined it in 0.5.0.</w:t>
       </w:r>
     </w:p>
     <w:p>
@@ -536,7 +556,10 @@
           <w:b/>
           <w:bCs/>
         </w:rPr>
-        <w:t xml:space="preserve">Not yet: planned for round 2.</w:t>
+        <w:t xml:space="preserve">Done.</w:t>
+      </w:r>
+      <w:r>
+        <w:t xml:space="preserve"> One-Time Order (0.3.0) and Recommended Reorder (0.4.0) take several branches and franchises, and 0.5.0 adds several dealer groups. One order per branch and franchise.</w:t>
       </w:r>
     </w:p>
     <w:p>
@@ -575,10 +598,20 @@
           <w:b/>
           <w:bCs/>
         </w:rPr>
-        <w:t xml:space="preserve">Not yet: planned for round 2.</w:t>
-      </w:r>
-      <w:r>
-        <w:t xml:space="preserve"> Questions for it are in Part 4.</w:t>
+        <w:t xml:space="preserve">Partly done (0.5.0).</w:t>
+      </w:r>
+      <w:r>
+        <w:t xml:space="preserve"> Both kinds are suggested every morning and shown on Home, Recommended Reorder and a new </w:t>
+      </w:r>
+      <w:r>
+        <w:rPr>
+          <w:b/>
+          <w:bCs/>
+        </w:rPr>
+        <w:t xml:space="preserve">Transfers</w:t>
+      </w:r>
+      <w:r>
+        <w:t xml:space="preserve"> page, to key into Equip by hand. Ticking and saving transfers, and a transfer rules page, come next. Your answers are in Part 5.</w:t>
       </w:r>
     </w:p>
     <w:p>
@@ -799,7 +832,20 @@
           <w:b/>
           <w:bCs/>
         </w:rPr>
-        <w:t xml:space="preserve">Not yet: planned for round 2.</w:t>
+        <w:t xml:space="preserve">Done (0.5.0).</w:t>
+      </w:r>
+      <w:r>
+        <w:t xml:space="preserve"> </w:t>
+      </w:r>
+      <w:r>
+        <w:rPr>
+          <w:b/>
+          <w:bCs/>
+        </w:rPr>
+        <w:t xml:space="preserve">Phase in…</w:t>
+      </w:r>
+      <w:r>
+        <w:t xml:space="preserve"> on the Settings tab and in the Recommended Reorder row detail. The target is at least the quantity until the end date, or until the part has the demands its rule needs. Listed on Special statuses.</w:t>
       </w:r>
     </w:p>
     <w:p>
@@ -1389,7 +1435,7 @@
         <w:pStyle w:val="Heading2"/>
       </w:pPr>
       <w:r>
-        <w:t xml:space="preserve">N4. For round 2</w:t>
+        <w:t xml:space="preserve">N4. For round 2 (answered)</w:t>
       </w:r>
     </w:p>
     <w:p>
@@ -1409,7 +1455,7 @@
         <w:t xml:space="preserve">Transfers:</w:t>
       </w:r>
       <w:r>
-        <w:t xml:space="preserve"> is "excess = more than 12 months of supply at the sending branch" the right default? For redistribution, what should a receiving branch’s default limit be, in months of supply?</w:t>
+        <w:t xml:space="preserve"> you confirmed 12 months and 6 months (Part 5, T1 and T4).</w:t>
       </w:r>
     </w:p>
     <w:p>
@@ -1429,7 +1475,7 @@
         <w:t xml:space="preserve">Several branches:</w:t>
       </w:r>
       <w:r>
-        <w:t xml:space="preserve"> when several branches are picked, is the order still one per branch and franchise?</w:t>
+        <w:t xml:space="preserve"> built as one order per branch and franchise (0.4.0). Tell us if that’s wrong.</w:t>
       </w:r>
     </w:p>
     <w:p>
@@ -1449,7 +1495,24 @@
         <w:t xml:space="preserve">Phase-in:</w:t>
       </w:r>
       <w:r>
-        <w:t xml:space="preserve"> set on the part’s Settings tab with a quantity and an end date (default 12 months from today)?</w:t>
+        <w:t xml:space="preserve"> you confirmed it (T7), and it is built that way.</w:t>
+      </w:r>
+    </w:p>
+    <w:p>
+      <w:pPr>
+        <w:pStyle w:val="Heading2"/>
+      </w:pPr>
+      <w:r>
+        <w:t xml:space="preserve">N5. Non-JD price changes (for a later round)</w:t>
+      </w:r>
+    </w:p>
+    <w:p>
+      <w:pPr>
+        <w:keepNext w:val="false"/>
+        <w:spacing w:after="120"/>
+      </w:pPr>
+      <w:r>
+        <w:t xml:space="preserve">How do non-JD part prices change today? Who updates cost and sell price in Equip, how often, and does each vendor send a price file? When John Deere parts join the tool, we’d like to show a part’s price change history (we already keep it for JD parts). Would the same be useful for non-JD parts, and is there a source we could read it from?</w:t>
       </w:r>
     </w:p>
     <w:p>
@@ -1510,6 +1573,387 @@
       <w:pPr>
         <w:spacing w:after="160"/>
       </w:pPr>
+    </w:p>
+    <w:p>
+      <w:pPr>
+        <w:pStyle w:val="Heading1"/>
+      </w:pPr>
+      <w:r>
+        <w:t xml:space="preserve">Part 5: transfers and phase-in</w:t>
+      </w:r>
+    </w:p>
+    <w:p>
+      <w:pPr>
+        <w:keepNext w:val="false"/>
+        <w:spacing w:after="120"/>
+      </w:pPr>
+      <w:r>
+        <w:t xml:space="preserve">You answered these on October 27. They are built in 0.5.0: the suggestions are shown, and saving transfers comes next.</w:t>
+      </w:r>
+    </w:p>
+    <w:p>
+      <w:pPr>
+        <w:pStyle w:val="Heading2"/>
+      </w:pPr>
+      <w:r>
+        <w:t xml:space="preserve">T1. Extra stock (answered)</w:t>
+      </w:r>
+    </w:p>
+    <w:p>
+      <w:pPr>
+        <w:keepNext/>
+        <w:pBdr>
+          <w:left w:val="single" w:color="1F4E79" w:sz="12" w:space="8"/>
+        </w:pBdr>
+        <w:spacing w:before="60" w:after="160"/>
+        <w:ind w:left="360"/>
+      </w:pPr>
+      <w:r>
+        <w:rPr>
+          <w:i/>
+          <w:iCs/>
+          <w:color w:val="404040"/>
+        </w:rPr>
+        <w:t xml:space="preserve">Ben: correct, and it must be a field the rules can change.</w:t>
+      </w:r>
+    </w:p>
+    <w:p>
+      <w:pPr>
+        <w:keepNext w:val="false"/>
+        <w:spacing w:after="120"/>
+      </w:pPr>
+      <w:r>
+        <w:rPr>
+          <w:b/>
+          <w:bCs/>
+        </w:rPr>
+        <w:t xml:space="preserve">Done.</w:t>
+      </w:r>
+      <w:r>
+        <w:t xml:space="preserve"> </w:t>
+      </w:r>
+      <w:r>
+        <w:rPr>
+          <w:b/>
+          <w:bCs/>
+        </w:rPr>
+        <w:t xml:space="preserve">ExcessSupply</w:t>
+      </w:r>
+      <w:r>
+        <w:t xml:space="preserve"> on each transfer rule, default 12 months of supply.</w:t>
+      </w:r>
+    </w:p>
+    <w:p>
+      <w:pPr>
+        <w:pStyle w:val="Heading2"/>
+      </w:pPr>
+      <w:r>
+        <w:t xml:space="preserve">T2. Transfer before buying (answered)</w:t>
+      </w:r>
+    </w:p>
+    <w:p>
+      <w:pPr>
+        <w:keepNext/>
+        <w:pBdr>
+          <w:left w:val="single" w:color="1F4E79" w:sz="12" w:space="8"/>
+        </w:pBdr>
+        <w:spacing w:before="60" w:after="160"/>
+        <w:ind w:left="360"/>
+      </w:pPr>
+      <w:r>
+        <w:rPr>
+          <w:i/>
+          <w:iCs/>
+          <w:color w:val="404040"/>
+        </w:rPr>
+        <w:t xml:space="preserve">Ben: correct; if we decide not to transfer, the order goes back to the recommended quantity.</w:t>
+      </w:r>
+    </w:p>
+    <w:p>
+      <w:pPr>
+        <w:keepNext w:val="false"/>
+        <w:spacing w:after="120"/>
+      </w:pPr>
+      <w:r>
+        <w:rPr>
+          <w:b/>
+          <w:bCs/>
+        </w:rPr>
+        <w:t xml:space="preserve">Done.</w:t>
+      </w:r>
+      <w:r>
+        <w:t xml:space="preserve"> Minimums with no demand never pull a transfer (unless the part has an active phase-in). Unticking a transfer putting the order back comes with saving transfers.</w:t>
+      </w:r>
+    </w:p>
+    <w:p>
+      <w:pPr>
+        <w:pStyle w:val="Heading2"/>
+      </w:pPr>
+      <w:r>
+        <w:t xml:space="preserve">T3. Order of filling (answered)</w:t>
+      </w:r>
+    </w:p>
+    <w:p>
+      <w:pPr>
+        <w:keepNext/>
+        <w:pBdr>
+          <w:left w:val="single" w:color="1F4E79" w:sz="12" w:space="8"/>
+        </w:pBdr>
+        <w:spacing w:before="60" w:after="160"/>
+        <w:ind w:left="360"/>
+      </w:pPr>
+      <w:r>
+        <w:rPr>
+          <w:i/>
+          <w:iCs/>
+          <w:color w:val="404040"/>
+        </w:rPr>
+        <w:t xml:space="preserve">Ben: the branch with the greatest months of supply sends first; the lowest receives first. No branch-pair rules.</w:t>
+      </w:r>
+    </w:p>
+    <w:p>
+      <w:pPr>
+        <w:keepNext w:val="false"/>
+        <w:spacing w:after="120"/>
+      </w:pPr>
+      <w:r>
+        <w:rPr>
+          <w:b/>
+          <w:bCs/>
+        </w:rPr>
+        <w:t xml:space="preserve">Done.</w:t>
+      </w:r>
+      <w:r>
+        <w:t xml:space="preserve"> That order, chosen again after every line. No branch-pair rules.</w:t>
+      </w:r>
+    </w:p>
+    <w:p>
+      <w:pPr>
+        <w:pStyle w:val="Heading2"/>
+      </w:pPr>
+      <w:r>
+        <w:t xml:space="preserve">T4. Redistribution (answered)</w:t>
+      </w:r>
+    </w:p>
+    <w:p>
+      <w:pPr>
+        <w:keepNext/>
+        <w:pBdr>
+          <w:left w:val="single" w:color="1F4E79" w:sz="12" w:space="8"/>
+        </w:pBdr>
+        <w:spacing w:before="60" w:after="160"/>
+        <w:ind w:left="360"/>
+      </w:pPr>
+      <w:r>
+        <w:rPr>
+          <w:i/>
+          <w:iCs/>
+          <w:color w:val="404040"/>
+        </w:rPr>
+        <w:t xml:space="preserve">Ben: 6 months is good for now; no minimum dollar amount, but it must be a field the rules can change.</w:t>
+      </w:r>
+    </w:p>
+    <w:p>
+      <w:pPr>
+        <w:keepNext w:val="false"/>
+        <w:spacing w:after="120"/>
+      </w:pPr>
+      <w:r>
+        <w:rPr>
+          <w:b/>
+          <w:bCs/>
+        </w:rPr>
+        <w:t xml:space="preserve">Done.</w:t>
+      </w:r>
+      <w:r>
+        <w:t xml:space="preserve"> Receive up to 6 months (</w:t>
+      </w:r>
+      <w:r>
+        <w:rPr>
+          <w:b/>
+          <w:bCs/>
+        </w:rPr>
+        <w:t xml:space="preserve">RedistMax</w:t>
+      </w:r>
+      <w:r>
+        <w:t xml:space="preserve">). </w:t>
+      </w:r>
+      <w:r>
+        <w:rPr>
+          <w:b/>
+          <w:bCs/>
+        </w:rPr>
+        <w:t xml:space="preserve">RedistMinValue</w:t>
+      </w:r>
+      <w:r>
+        <w:t xml:space="preserve"> defaults to $0.</w:t>
+      </w:r>
+    </w:p>
+    <w:p>
+      <w:pPr>
+        <w:pStyle w:val="Heading2"/>
+      </w:pPr>
+      <w:r>
+        <w:t xml:space="preserve">T5. Saving (answered)</w:t>
+      </w:r>
+    </w:p>
+    <w:p>
+      <w:pPr>
+        <w:keepNext/>
+        <w:pBdr>
+          <w:left w:val="single" w:color="1F4E79" w:sz="12" w:space="8"/>
+        </w:pBdr>
+        <w:spacing w:before="60" w:after="160"/>
+        <w:ind w:left="360"/>
+      </w:pPr>
+      <w:r>
+        <w:rPr>
+          <w:i/>
+          <w:iCs/>
+          <w:color w:val="404040"/>
+        </w:rPr>
+        <w:t xml:space="preserve">Ben: keep branch pairs together; all franchises together with a franchise filter; key into Equip by hand; both kinds ticked, with an indicator of the kind.</w:t>
+      </w:r>
+    </w:p>
+    <w:p>
+      <w:pPr>
+        <w:keepNext w:val="false"/>
+        <w:spacing w:after="120"/>
+      </w:pPr>
+      <w:r>
+        <w:rPr>
+          <w:b/>
+          <w:bCs/>
+        </w:rPr>
+        <w:t xml:space="preserve">Done in 0.5.0:</w:t>
+      </w:r>
+      <w:r>
+        <w:t xml:space="preserve"> the Transfers page with a franchise filter, a </w:t>
+      </w:r>
+      <w:r>
+        <w:rPr>
+          <w:b/>
+          <w:bCs/>
+        </w:rPr>
+        <w:t xml:space="preserve">Conventional / Redistribution</w:t>
+      </w:r>
+      <w:r>
+        <w:t xml:space="preserve"> badge on every line and a CSV export. </w:t>
+      </w:r>
+      <w:r>
+        <w:rPr>
+          <w:b/>
+          <w:bCs/>
+        </w:rPr>
+        <w:t xml:space="preserve">Next version:</w:t>
+      </w:r>
+      <w:r>
+        <w:t xml:space="preserve"> one saved transfer per branch pair, both kinds ticked.</w:t>
+      </w:r>
+    </w:p>
+    <w:p>
+      <w:pPr>
+        <w:pStyle w:val="Heading2"/>
+      </w:pPr>
+      <w:r>
+        <w:t xml:space="preserve">T6. Wording (answered)</w:t>
+      </w:r>
+    </w:p>
+    <w:p>
+      <w:pPr>
+        <w:keepNext/>
+        <w:pBdr>
+          <w:left w:val="single" w:color="1F4E79" w:sz="12" w:space="8"/>
+        </w:pBdr>
+        <w:spacing w:before="60" w:after="160"/>
+        <w:ind w:left="360"/>
+      </w:pPr>
+      <w:r>
+        <w:rPr>
+          <w:i/>
+          <w:iCs/>
+          <w:color w:val="404040"/>
+        </w:rPr>
+        <w:t xml:space="preserve">Ben: keep “Excess”, meaning months of supply over the threshold in T1, to match John Deere.</w:t>
+      </w:r>
+    </w:p>
+    <w:p>
+      <w:pPr>
+        <w:keepNext w:val="false"/>
+        <w:spacing w:after="120"/>
+      </w:pPr>
+      <w:r>
+        <w:rPr>
+          <w:b/>
+          <w:bCs/>
+        </w:rPr>
+        <w:t xml:space="preserve">Done.</w:t>
+      </w:r>
+      <w:r>
+        <w:t xml:space="preserve"> </w:t>
+      </w:r>
+      <w:r>
+        <w:rPr>
+          <w:b/>
+          <w:bCs/>
+        </w:rPr>
+        <w:t xml:space="preserve">Excess</w:t>
+      </w:r>
+      <w:r>
+        <w:t xml:space="preserve"> has that meaning; round 1’s figure is now </w:t>
+      </w:r>
+      <w:r>
+        <w:rPr>
+          <w:b/>
+          <w:bCs/>
+        </w:rPr>
+        <w:t xml:space="preserve">Above target</w:t>
+      </w:r>
+      <w:r>
+        <w:t xml:space="preserve">. Excess shows in units and months.</w:t>
+      </w:r>
+    </w:p>
+    <w:p>
+      <w:pPr>
+        <w:pStyle w:val="Heading2"/>
+      </w:pPr>
+      <w:r>
+        <w:t xml:space="preserve">T7. Phase-in (answered)</w:t>
+      </w:r>
+    </w:p>
+    <w:p>
+      <w:pPr>
+        <w:keepNext/>
+        <w:pBdr>
+          <w:left w:val="single" w:color="1F4E79" w:sz="12" w:space="8"/>
+        </w:pBdr>
+        <w:spacing w:before="60" w:after="160"/>
+        <w:ind w:left="360"/>
+      </w:pPr>
+      <w:r>
+        <w:rPr>
+          <w:i/>
+          <w:iCs/>
+          <w:color w:val="404040"/>
+        </w:rPr>
+        <w:t xml:space="preserve">Ben: correct.</w:t>
+      </w:r>
+    </w:p>
+    <w:p>
+      <w:pPr>
+        <w:keepNext w:val="false"/>
+        <w:spacing w:after="120"/>
+      </w:pPr>
+      <w:r>
+        <w:rPr>
+          <w:b/>
+          <w:bCs/>
+        </w:rPr>
+        <w:t xml:space="preserve">Done.</w:t>
+      </w:r>
+      <w:r>
+        <w:t xml:space="preserve"> See Q8.</w:t>
+      </w:r>
     </w:p>
     <w:p>
       <w:pPr>

</xml_diff>

<commit_message>
Non-JD docs: 0.7.0 One-Time transfers, TRANSFER-RULES guide, Round 2 changes, N2 answered
Co-Authored-By: Claude Opus 5.5 <noreply@anthropic.com>
</commit_message>
<xml_diff>
--- a/projects/part order tool - app/for-users/Non-JD Order Tool - Questions.docx
+++ b/projects/part order tool - app/for-users/Non-JD Order Tool - Questions.docx
@@ -21,7 +21,7 @@
         <w:rPr>
           <w:color w:val="595959"/>
         </w:rPr>
-        <w:t xml:space="preserve">For Ben, with a section for Shannon · Updated October 28, 2026 (version 0.5.0) · App: https://10.110.100.13:8443</w:t>
+        <w:t xml:space="preserve">For Ben, with a section for Shannon · Updated October 29, 2026 (version 0.7.0) · App: https://10.110.100.13:8443</w:t>
       </w:r>
     </w:p>
     <w:p>
@@ -40,7 +40,7 @@
         <w:t xml:space="preserve">Part 5</w:t>
       </w:r>
       <w:r>
-        <w:t xml:space="preserve">) on October 27. Each answered item gives his answer in one line and what we did. Still open: </w:t>
+        <w:t xml:space="preserve">) on October 27. Each answered item gives his answer in one line and what we did. Nothing is open now: </w:t>
       </w:r>
       <w:r>
         <w:rPr>
@@ -50,7 +50,7 @@
         <w:t xml:space="preserve">N2</w:t>
       </w:r>
       <w:r>
-        <w:t xml:space="preserve">. </w:t>
+        <w:t xml:space="preserve"> was answered on October 29. </w:t>
       </w:r>
       <w:r>
         <w:rPr>
@@ -1149,16 +1149,41 @@
         <w:pStyle w:val="Heading2"/>
       </w:pPr>
       <w:r>
-        <w:t xml:space="preserve">N2. The "Show minimums with no demand" switch</w:t>
-      </w:r>
-    </w:p>
-    <w:p>
-      <w:pPr>
-        <w:keepNext w:val="false"/>
-        <w:spacing w:after="120"/>
-      </w:pPr>
-      <w:r>
-        <w:t xml:space="preserve">It is </w:t>
+        <w:t xml:space="preserve">N2. The "Show minimums with no demand" switch (answered)</w:t>
+      </w:r>
+    </w:p>
+    <w:p>
+      <w:pPr>
+        <w:keepNext/>
+        <w:pBdr>
+          <w:left w:val="single" w:color="1F4E79" w:sz="12" w:space="8"/>
+        </w:pBdr>
+        <w:spacing w:before="60" w:after="160"/>
+        <w:ind w:left="360"/>
+      </w:pPr>
+      <w:r>
+        <w:rPr>
+          <w:i/>
+          <w:iCs/>
+          <w:color w:val="404040"/>
+        </w:rPr>
+        <w:t xml:space="preserve">Brian, October 29: keep it off for now.</w:t>
+      </w:r>
+    </w:p>
+    <w:p>
+      <w:pPr>
+        <w:keepNext w:val="false"/>
+        <w:spacing w:after="120"/>
+      </w:pPr>
+      <w:r>
+        <w:rPr>
+          <w:b/>
+          <w:bCs/>
+        </w:rPr>
+        <w:t xml:space="preserve">No change.</w:t>
+      </w:r>
+      <w:r>
+        <w:t xml:space="preserve"> The switch stays </w:t>
       </w:r>
       <w:r>
         <w:rPr>
@@ -1168,67 +1193,8 @@
         <w:t xml:space="preserve">off</w:t>
       </w:r>
       <w:r>
-        <w:t xml:space="preserve"> when Recommended Reorder opens, so lines that are there only because of an Equip minimum on a part with no activity are hidden, and Home doesn’t count them (Branch 1 on October 26: 220 parts to order, plus 21 hidden). Is off the right starting point, or should they show every time?</w:t>
-      </w:r>
-    </w:p>
-    <w:p>
-      <w:pPr>
-        <w:keepNext/>
-        <w:spacing w:before="120" w:after="60"/>
-      </w:pPr>
-      <w:r>
-        <w:rPr>
-          <w:b/>
-          <w:bCs/>
-          <w:color w:val="1F4E79"/>
-        </w:rPr>
-        <w:t xml:space="preserve">Your answer:</w:t>
-      </w:r>
-    </w:p>
-    <w:tbl>
-      <w:tblPr>
-        <w:tblW w:type="dxa" w:w="10080"/>
-        <w:tblBorders>
-          <w:top w:val="single" w:color="auto" w:sz="4"/>
-          <w:left w:val="single" w:color="auto" w:sz="4"/>
-          <w:bottom w:val="single" w:color="auto" w:sz="4"/>
-          <w:right w:val="single" w:color="auto" w:sz="4"/>
-          <w:insideH w:val="single" w:color="auto" w:sz="4"/>
-          <w:insideV w:val="single" w:color="auto" w:sz="4"/>
-        </w:tblBorders>
-      </w:tblPr>
-      <w:tblGrid>
-        <w:gridCol w:w="10080"/>
-      </w:tblGrid>
-      <w:tr>
-        <w:trPr>
-          <w:cantSplit/>
-          <w:trHeight w:val="900" w:hRule="atLeast"/>
-        </w:trPr>
-        <w:tc>
-          <w:tcPr>
-            <w:tcW w:type="dxa" w:w="10080"/>
-            <w:tcBorders>
-              <w:top w:val="single" w:color="A6A6A6" w:sz="4"/>
-              <w:left w:val="single" w:color="A6A6A6" w:sz="4"/>
-              <w:bottom w:val="single" w:color="A6A6A6" w:sz="4"/>
-              <w:right w:val="single" w:color="A6A6A6" w:sz="4"/>
-            </w:tcBorders>
-            <w:tcMar>
-              <w:top w:type="dxa" w:w="80"/>
-              <w:left w:type="dxa" w:w="120"/>
-              <w:bottom w:type="dxa" w:w="80"/>
-              <w:right w:type="dxa" w:w="120"/>
-            </w:tcMar>
-          </w:tcPr>
-          <w:p/>
-        </w:tc>
-      </w:tr>
-    </w:tbl>
-    <w:p>
-      <w:pPr>
-        <w:spacing w:after="160"/>
-      </w:pPr>
+        <w:t xml:space="preserve"> when Recommended Reorder opens, so lines that are there only because of an Equip minimum on a part with no activity are hidden, and Home doesn’t count them (Branch 1 on October 26: 220 parts to order, plus 21 hidden). Turn it on to see them; Cleanup lists them to fix in Equip.</w:t>
+      </w:r>
     </w:p>
     <w:p>
       <w:pPr>

</xml_diff>